<commit_message>
Docs(resume): updated editable resume files
</commit_message>
<xml_diff>
--- a/public/files/editableDocs/Huann Almeida EN.docx
+++ b/public/files/editableDocs/Huann Almeida EN.docx
@@ -1,6 +1,6 @@
 
 <file path=word/document.xml><?xml version="1.0" encoding="utf-8"?>
-<w:document xmlns:wpc="http://schemas.microsoft.com/office/word/2010/wordprocessingCanvas" xmlns:cx="http://schemas.microsoft.com/office/drawing/2014/chartex" xmlns:cx1="http://schemas.microsoft.com/office/drawing/2015/9/8/chartex" xmlns:cx2="http://schemas.microsoft.com/office/drawing/2015/10/21/chartex" xmlns:cx3="http://schemas.microsoft.com/office/drawing/2016/5/9/chartex" xmlns:cx4="http://schemas.microsoft.com/office/drawing/2016/5/10/chartex" xmlns:cx5="http://schemas.microsoft.com/office/drawing/2016/5/11/chartex" xmlns:cx6="http://schemas.microsoft.com/office/drawing/2016/5/12/chartex" xmlns:cx7="http://schemas.microsoft.com/office/drawing/2016/5/13/chartex" xmlns:cx8="http://schemas.microsoft.com/office/drawing/2016/5/14/chartex" xmlns:mc="http://schemas.openxmlformats.org/markup-compatibility/2006" xmlns:aink="http://schemas.microsoft.com/office/drawing/2016/ink" xmlns:am3d="http://schemas.microsoft.com/office/drawing/2017/model3d" xmlns:o="urn:schemas-microsoft-com:office:office" xmlns:oel="http://schemas.microsoft.com/office/2019/extlst" xmlns:r="http://schemas.openxmlformats.org/officeDocument/2006/relationships" xmlns:m="http://schemas.openxmlformats.org/officeDocument/2006/math" xmlns:v="urn:schemas-microsoft-com:vml" xmlns:wp14="http://schemas.microsoft.com/office/word/2010/wordprocessingDrawing" xmlns:wp="http://schemas.openxmlformats.org/drawingml/2006/wordprocessingDrawing" xmlns:w10="urn:schemas-microsoft-com:office:word" xmlns:w="http://schemas.openxmlformats.org/wordprocessingml/2006/main" xmlns:w14="http://schemas.microsoft.com/office/word/2010/wordml" xmlns:w15="http://schemas.microsoft.com/office/word/2012/wordml" xmlns:w16cex="http://schemas.microsoft.com/office/word/2018/wordml/cex" xmlns:w16cid="http://schemas.microsoft.com/office/word/2016/wordml/cid" xmlns:w16="http://schemas.microsoft.com/office/word/2018/wordml" xmlns:w16du="http://schemas.microsoft.com/office/word/2023/wordml/word16du" xmlns:w16sdtdh="http://schemas.microsoft.com/office/word/2020/wordml/sdtdatahash" xmlns:w16sdtfl="http://schemas.microsoft.com/office/word/2024/wordml/sdtformatlock" xmlns:w16se="http://schemas.microsoft.com/office/word/2015/wordml/symex" xmlns:wpg="http://schemas.microsoft.com/office/word/2010/wordprocessingGroup" xmlns:wpi="http://schemas.microsoft.com/office/word/2010/wordprocessingInk" xmlns:wne="http://schemas.microsoft.com/office/word/2006/wordml" xmlns:wps="http://schemas.microsoft.com/office/word/2010/wordprocessingShape" mc:Ignorable="w14 w15 w16se w16cid w16 w16cex w16sdtdh w16sdtfl w16du wp14">
+<w:document xmlns:wpc="http://schemas.microsoft.com/office/word/2010/wordprocessingCanvas" xmlns:cx="http://schemas.microsoft.com/office/drawing/2014/chartex" xmlns:cx1="http://schemas.microsoft.com/office/drawing/2015/9/8/chartex" xmlns:cx2="http://schemas.microsoft.com/office/drawing/2015/10/21/chartex" xmlns:cx3="http://schemas.microsoft.com/office/drawing/2016/5/9/chartex" xmlns:cx4="http://schemas.microsoft.com/office/drawing/2016/5/10/chartex" xmlns:cx5="http://schemas.microsoft.com/office/drawing/2016/5/11/chartex" xmlns:cx6="http://schemas.microsoft.com/office/drawing/2016/5/12/chartex" xmlns:cx7="http://schemas.microsoft.com/office/drawing/2016/5/13/chartex" xmlns:cx8="http://schemas.microsoft.com/office/drawing/2016/5/14/chartex" xmlns:mc="http://schemas.openxmlformats.org/markup-compatibility/2006" xmlns:aink="http://schemas.microsoft.com/office/drawing/2016/ink" xmlns:am3d="http://schemas.microsoft.com/office/drawing/2017/model3d" xmlns:o="urn:schemas-microsoft-com:office:office" xmlns:oel="http://schemas.microsoft.com/office/2019/extlst" xmlns:r="http://schemas.openxmlformats.org/officeDocument/2006/relationships" xmlns:m="http://schemas.openxmlformats.org/officeDocument/2006/math" xmlns:v="urn:schemas-microsoft-com:vml" xmlns:wp14="http://schemas.microsoft.com/office/word/2010/wordprocessingDrawing" xmlns:wp="http://schemas.openxmlformats.org/drawingml/2006/wordprocessingDrawing" xmlns:w10="urn:schemas-microsoft-com:office:word" xmlns:w="http://schemas.openxmlformats.org/wordprocessingml/2006/main" xmlns:w14="http://schemas.microsoft.com/office/word/2010/wordml" xmlns:w15="http://schemas.microsoft.com/office/word/2012/wordml" xmlns:w16cex="http://schemas.microsoft.com/office/word/2018/wordml/cex" xmlns:w16cid="http://schemas.microsoft.com/office/word/2016/wordml/cid" xmlns:w16="http://schemas.microsoft.com/office/word/2018/wordml" xmlns:w16sdtdh="http://schemas.microsoft.com/office/word/2020/wordml/sdtdatahash" xmlns:w16se="http://schemas.microsoft.com/office/word/2015/wordml/symex" xmlns:wpg="http://schemas.microsoft.com/office/word/2010/wordprocessingGroup" xmlns:wpi="http://schemas.microsoft.com/office/word/2010/wordprocessingInk" xmlns:wne="http://schemas.microsoft.com/office/word/2006/wordml" xmlns:wps="http://schemas.microsoft.com/office/word/2010/wordprocessingShape" mc:Ignorable="w14 w15 w16se w16cid w16 w16cex w16sdtdh wp14">
   <w:body>
     <w:p>
       <w:pPr>
@@ -32,16 +32,19 @@
         </w:rPr>
       </w:pPr>
       <w:r>
+        <w:rPr>
+          <w:b/>
+          <w:bCs/>
+        </w:rPr>
         <w:t>Full Stack Developer</w:t>
       </w:r>
       <w:r>
-        <w:t xml:space="preserve"> </w:t>
-      </w:r>
-      <w:r>
-        <w:rPr>
-          <w:b/>
-          <w:bCs/>
-        </w:rPr>
+        <w:tab/>
+      </w:r>
+      <w:r>
+        <w:tab/>
+      </w:r>
+      <w:r>
         <w:t>•</w:t>
       </w:r>
       <w:r>
@@ -62,10 +65,20 @@
           <w:b/>
           <w:bCs/>
         </w:rPr>
-        <w:t xml:space="preserve"> • </w:t>
-      </w:r>
-      <w:r>
-        <w:t xml:space="preserve">GitHub: </w:t>
+        <w:t xml:space="preserve"> </w:t>
+      </w:r>
+      <w:r>
+        <w:rPr>
+          <w:b/>
+          <w:bCs/>
+        </w:rPr>
+        <w:tab/>
+      </w:r>
+      <w:r>
+        <w:t>•</w:t>
+      </w:r>
+      <w:r>
+        <w:t xml:space="preserve"> </w:t>
       </w:r>
       <w:hyperlink r:id="rId7" w:history="1">
         <w:r>
@@ -93,17 +106,14 @@
       </w:r>
       <w:bookmarkStart w:id="0" w:name="_Hlk204853790"/>
       <w:r>
+        <w:tab/>
+      </w:r>
+      <w:r>
         <w:t>•</w:t>
       </w:r>
       <w:bookmarkEnd w:id="0"/>
       <w:r>
         <w:t xml:space="preserve"> </w:t>
-      </w:r>
-      <w:r>
-        <w:t xml:space="preserve">+55 </w:t>
-      </w:r>
-      <w:r>
-        <w:t xml:space="preserve">(83) 99126-3772 | </w:t>
       </w:r>
       <w:hyperlink r:id="rId8" w:history="1">
         <w:r>
@@ -115,7 +125,13 @@
         </w:r>
       </w:hyperlink>
       <w:r>
-        <w:t xml:space="preserve"> (WhatsApp) • </w:t>
+        <w:t xml:space="preserve"> (WhatsApp) </w:t>
+      </w:r>
+      <w:r>
+        <w:tab/>
+      </w:r>
+      <w:r>
+        <w:t xml:space="preserve">• </w:t>
       </w:r>
       <w:hyperlink r:id="rId9">
         <w:r>
@@ -603,7 +619,23 @@
           <w:b/>
           <w:bCs/>
         </w:rPr>
-        <w:t xml:space="preserve">Sales Assistant &amp; Automation Developer | Editora </w:t>
+        <w:t xml:space="preserve">Sales Assistant &amp; Automation Developer | </w:t>
+      </w:r>
+      <w:proofErr w:type="spellStart"/>
+      <w:r>
+        <w:rPr>
+          <w:b/>
+          <w:bCs/>
+        </w:rPr>
+        <w:t>Editora</w:t>
+      </w:r>
+      <w:proofErr w:type="spellEnd"/>
+      <w:r>
+        <w:rPr>
+          <w:b/>
+          <w:bCs/>
+        </w:rPr>
+        <w:t xml:space="preserve"> </w:t>
       </w:r>
       <w:proofErr w:type="spellStart"/>
       <w:r>
@@ -731,14 +763,7 @@
           <w:b/>
           <w:bCs/>
         </w:rPr>
-        <w:t>Front-end Tech Lead | Skill Labs</w:t>
-      </w:r>
-      <w:r>
-        <w:rPr>
-          <w:b/>
-          <w:bCs/>
-        </w:rPr>
-        <w:t xml:space="preserve"> </w:t>
+        <w:t xml:space="preserve">Front-end Tech Lead | Skill Labs </w:t>
       </w:r>
       <w:r>
         <w:t>|</w:t>
@@ -994,14 +1019,7 @@
           <w:b/>
           <w:bCs/>
         </w:rPr>
-        <w:t>Front-end Developer</w:t>
-      </w:r>
-      <w:r>
-        <w:rPr>
-          <w:b/>
-          <w:bCs/>
-        </w:rPr>
-        <w:t xml:space="preserve"> </w:t>
+        <w:t xml:space="preserve">Front-end Developer </w:t>
       </w:r>
       <w:r>
         <w:rPr>
@@ -1157,16 +1175,7 @@
           <w:szCs w:val="32"/>
         </w:rPr>
         <w:lastRenderedPageBreak/>
-        <w:t>Featured Projects</w:t>
-      </w:r>
-      <w:r>
-        <w:rPr>
-          <w:b/>
-          <w:bCs/>
-          <w:sz w:val="32"/>
-          <w:szCs w:val="32"/>
-        </w:rPr>
-        <w:t xml:space="preserve"> </w:t>
+        <w:t xml:space="preserve">Featured Projects </w:t>
       </w:r>
       <w:r>
         <w:rPr>
@@ -1432,14 +1441,7 @@
           <w:b/>
           <w:bCs/>
         </w:rPr>
-        <w:t>Business Automation Suite &amp; RPA</w:t>
-      </w:r>
-      <w:r>
-        <w:rPr>
-          <w:b/>
-          <w:bCs/>
-        </w:rPr>
-        <w:t xml:space="preserve"> </w:t>
+        <w:t xml:space="preserve">Business Automation Suite &amp; RPA </w:t>
       </w:r>
       <w:r>
         <w:rPr>
@@ -1880,13 +1882,37 @@
           <w:b/>
           <w:bCs/>
         </w:rPr>
-        <w:t>Analysis and Systems Development</w:t>
-      </w:r>
-      <w:r>
-        <w:rPr>
-          <w:b/>
-          <w:bCs/>
-        </w:rPr>
+        <w:t>(</w:t>
+      </w:r>
+      <w:r>
+        <w:rPr>
+          <w:b/>
+          <w:bCs/>
+        </w:rPr>
+        <w:t>2024 – 2026</w:t>
+      </w:r>
+      <w:r>
+        <w:rPr>
+          <w:b/>
+          <w:bCs/>
+        </w:rPr>
+        <w:t xml:space="preserve">) </w:t>
+      </w:r>
+      <w:r>
+        <w:rPr>
+          <w:b/>
+          <w:bCs/>
+        </w:rPr>
+        <w:t xml:space="preserve">Analysis and Systems Development </w:t>
+      </w:r>
+      <w:r>
+        <w:rPr>
+          <w:b/>
+          <w:bCs/>
+        </w:rPr>
+        <w:t>|</w:t>
+      </w:r>
+      <w:r>
         <w:t xml:space="preserve"> </w:t>
       </w:r>
       <w:r>
@@ -1894,16 +1920,6 @@
           <w:b/>
           <w:bCs/>
         </w:rPr>
-        <w:t>|</w:t>
-      </w:r>
-      <w:r>
-        <w:t xml:space="preserve"> </w:t>
-      </w:r>
-      <w:r>
-        <w:rPr>
-          <w:b/>
-          <w:bCs/>
-        </w:rPr>
         <w:t>Wyden</w:t>
       </w:r>
       <w:r>
@@ -1911,7 +1927,10 @@
           <w:b/>
           <w:bCs/>
         </w:rPr>
-        <w:t xml:space="preserve"> | (2024 – 2026, In Progress)</w:t>
+        <w:t xml:space="preserve"> | </w:t>
+      </w:r>
+      <w:r>
+        <w:t>(In Progress)</w:t>
       </w:r>
     </w:p>
     <w:p>
@@ -1962,7 +1981,7 @@
     </w:p>
     <w:p>
       <w:pPr>
-        <w:spacing w:after="0" w:line="276" w:lineRule="auto"/>
+        <w:spacing w:before="240" w:after="0" w:line="276" w:lineRule="auto"/>
       </w:pPr>
       <w:r>
         <w:rPr>
@@ -2019,7 +2038,7 @@
 </file>
 
 <file path=word/numbering.xml><?xml version="1.0" encoding="utf-8"?>
-<w:numbering xmlns:wpc="http://schemas.microsoft.com/office/word/2010/wordprocessingCanvas" xmlns:cx="http://schemas.microsoft.com/office/drawing/2014/chartex" xmlns:cx1="http://schemas.microsoft.com/office/drawing/2015/9/8/chartex" xmlns:cx2="http://schemas.microsoft.com/office/drawing/2015/10/21/chartex" xmlns:cx3="http://schemas.microsoft.com/office/drawing/2016/5/9/chartex" xmlns:cx4="http://schemas.microsoft.com/office/drawing/2016/5/10/chartex" xmlns:cx5="http://schemas.microsoft.com/office/drawing/2016/5/11/chartex" xmlns:cx6="http://schemas.microsoft.com/office/drawing/2016/5/12/chartex" xmlns:cx7="http://schemas.microsoft.com/office/drawing/2016/5/13/chartex" xmlns:cx8="http://schemas.microsoft.com/office/drawing/2016/5/14/chartex" xmlns:mc="http://schemas.openxmlformats.org/markup-compatibility/2006" xmlns:aink="http://schemas.microsoft.com/office/drawing/2016/ink" xmlns:am3d="http://schemas.microsoft.com/office/drawing/2017/model3d" xmlns:o="urn:schemas-microsoft-com:office:office" xmlns:oel="http://schemas.microsoft.com/office/2019/extlst" xmlns:r="http://schemas.openxmlformats.org/officeDocument/2006/relationships" xmlns:m="http://schemas.openxmlformats.org/officeDocument/2006/math" xmlns:v="urn:schemas-microsoft-com:vml" xmlns:wp14="http://schemas.microsoft.com/office/word/2010/wordprocessingDrawing" xmlns:wp="http://schemas.openxmlformats.org/drawingml/2006/wordprocessingDrawing" xmlns:w10="urn:schemas-microsoft-com:office:word" xmlns:w="http://schemas.openxmlformats.org/wordprocessingml/2006/main" xmlns:w14="http://schemas.microsoft.com/office/word/2010/wordml" xmlns:w15="http://schemas.microsoft.com/office/word/2012/wordml" xmlns:w16cex="http://schemas.microsoft.com/office/word/2018/wordml/cex" xmlns:w16cid="http://schemas.microsoft.com/office/word/2016/wordml/cid" xmlns:w16="http://schemas.microsoft.com/office/word/2018/wordml" xmlns:w16du="http://schemas.microsoft.com/office/word/2023/wordml/word16du" xmlns:w16sdtdh="http://schemas.microsoft.com/office/word/2020/wordml/sdtdatahash" xmlns:w16sdtfl="http://schemas.microsoft.com/office/word/2024/wordml/sdtformatlock" xmlns:w16se="http://schemas.microsoft.com/office/word/2015/wordml/symex" xmlns:wpg="http://schemas.microsoft.com/office/word/2010/wordprocessingGroup" xmlns:wpi="http://schemas.microsoft.com/office/word/2010/wordprocessingInk" xmlns:wne="http://schemas.microsoft.com/office/word/2006/wordml" xmlns:wps="http://schemas.microsoft.com/office/word/2010/wordprocessingShape" mc:Ignorable="w14 w15 w16se w16cid w16 w16cex w16sdtdh w16sdtfl w16du wp14">
+<w:numbering xmlns:wpc="http://schemas.microsoft.com/office/word/2010/wordprocessingCanvas" xmlns:cx="http://schemas.microsoft.com/office/drawing/2014/chartex" xmlns:cx1="http://schemas.microsoft.com/office/drawing/2015/9/8/chartex" xmlns:cx2="http://schemas.microsoft.com/office/drawing/2015/10/21/chartex" xmlns:cx3="http://schemas.microsoft.com/office/drawing/2016/5/9/chartex" xmlns:cx4="http://schemas.microsoft.com/office/drawing/2016/5/10/chartex" xmlns:cx5="http://schemas.microsoft.com/office/drawing/2016/5/11/chartex" xmlns:cx6="http://schemas.microsoft.com/office/drawing/2016/5/12/chartex" xmlns:cx7="http://schemas.microsoft.com/office/drawing/2016/5/13/chartex" xmlns:cx8="http://schemas.microsoft.com/office/drawing/2016/5/14/chartex" xmlns:mc="http://schemas.openxmlformats.org/markup-compatibility/2006" xmlns:aink="http://schemas.microsoft.com/office/drawing/2016/ink" xmlns:am3d="http://schemas.microsoft.com/office/drawing/2017/model3d" xmlns:o="urn:schemas-microsoft-com:office:office" xmlns:oel="http://schemas.microsoft.com/office/2019/extlst" xmlns:r="http://schemas.openxmlformats.org/officeDocument/2006/relationships" xmlns:m="http://schemas.openxmlformats.org/officeDocument/2006/math" xmlns:v="urn:schemas-microsoft-com:vml" xmlns:wp14="http://schemas.microsoft.com/office/word/2010/wordprocessingDrawing" xmlns:wp="http://schemas.openxmlformats.org/drawingml/2006/wordprocessingDrawing" xmlns:w10="urn:schemas-microsoft-com:office:word" xmlns:w="http://schemas.openxmlformats.org/wordprocessingml/2006/main" xmlns:w14="http://schemas.microsoft.com/office/word/2010/wordml" xmlns:w15="http://schemas.microsoft.com/office/word/2012/wordml" xmlns:w16cex="http://schemas.microsoft.com/office/word/2018/wordml/cex" xmlns:w16cid="http://schemas.microsoft.com/office/word/2016/wordml/cid" xmlns:w16="http://schemas.microsoft.com/office/word/2018/wordml" xmlns:w16sdtdh="http://schemas.microsoft.com/office/word/2020/wordml/sdtdatahash" xmlns:w16se="http://schemas.microsoft.com/office/word/2015/wordml/symex" xmlns:wpg="http://schemas.microsoft.com/office/word/2010/wordprocessingGroup" xmlns:wpi="http://schemas.microsoft.com/office/word/2010/wordprocessingInk" xmlns:wne="http://schemas.microsoft.com/office/word/2006/wordml" xmlns:wps="http://schemas.microsoft.com/office/word/2010/wordprocessingShape" mc:Ignorable="w14 w15 w16se w16cid w16 w16cex w16sdtdh wp14">
   <w:abstractNum w:abstractNumId="0" w15:restartNumberingAfterBreak="0">
     <w:nsid w:val="03DD578C"/>
     <w:multiLevelType w:val="hybridMultilevel"/>
@@ -4728,7 +4747,7 @@
 </file>
 
 <file path=word/styles.xml><?xml version="1.0" encoding="utf-8"?>
-<w:styles xmlns:mc="http://schemas.openxmlformats.org/markup-compatibility/2006" xmlns:r="http://schemas.openxmlformats.org/officeDocument/2006/relationships" xmlns:w="http://schemas.openxmlformats.org/wordprocessingml/2006/main" xmlns:w14="http://schemas.microsoft.com/office/word/2010/wordml" xmlns:w15="http://schemas.microsoft.com/office/word/2012/wordml" xmlns:w16cex="http://schemas.microsoft.com/office/word/2018/wordml/cex" xmlns:w16cid="http://schemas.microsoft.com/office/word/2016/wordml/cid" xmlns:w16="http://schemas.microsoft.com/office/word/2018/wordml" xmlns:w16du="http://schemas.microsoft.com/office/word/2023/wordml/word16du" xmlns:w16sdtdh="http://schemas.microsoft.com/office/word/2020/wordml/sdtdatahash" xmlns:w16sdtfl="http://schemas.microsoft.com/office/word/2024/wordml/sdtformatlock" xmlns:w16se="http://schemas.microsoft.com/office/word/2015/wordml/symex" mc:Ignorable="w14 w15 w16se w16cid w16 w16cex w16sdtdh w16sdtfl w16du">
+<w:styles xmlns:mc="http://schemas.openxmlformats.org/markup-compatibility/2006" xmlns:r="http://schemas.openxmlformats.org/officeDocument/2006/relationships" xmlns:w="http://schemas.openxmlformats.org/wordprocessingml/2006/main" xmlns:w14="http://schemas.microsoft.com/office/word/2010/wordml" xmlns:w15="http://schemas.microsoft.com/office/word/2012/wordml" xmlns:w16cex="http://schemas.microsoft.com/office/word/2018/wordml/cex" xmlns:w16cid="http://schemas.microsoft.com/office/word/2016/wordml/cid" xmlns:w16="http://schemas.microsoft.com/office/word/2018/wordml" xmlns:w16sdtdh="http://schemas.microsoft.com/office/word/2020/wordml/sdtdatahash" xmlns:w16se="http://schemas.microsoft.com/office/word/2015/wordml/symex" mc:Ignorable="w14 w15 w16se w16cid w16 w16cex w16sdtdh">
   <w:docDefaults>
     <w:rPrDefault>
       <w:rPr>
@@ -5332,6 +5351,7 @@
   <w:style w:type="character" w:default="1" w:styleId="Fontepargpadro">
     <w:name w:val="Default Paragraph Font"/>
     <w:uiPriority w:val="1"/>
+    <w:semiHidden/>
     <w:unhideWhenUsed/>
   </w:style>
   <w:style w:type="table" w:default="1" w:styleId="Tabelanormal">

</xml_diff>

<commit_message>
docs: update CV documents
</commit_message>
<xml_diff>
--- a/public/files/editableDocs/Huann Almeida EN.docx
+++ b/public/files/editableDocs/Huann Almeida EN.docx
@@ -1,6 +1,6 @@
 
 <file path=word/document.xml><?xml version="1.0" encoding="utf-8"?>
-<w:document xmlns:wpc="http://schemas.microsoft.com/office/word/2010/wordprocessingCanvas" xmlns:cx="http://schemas.microsoft.com/office/drawing/2014/chartex" xmlns:cx1="http://schemas.microsoft.com/office/drawing/2015/9/8/chartex" xmlns:cx2="http://schemas.microsoft.com/office/drawing/2015/10/21/chartex" xmlns:cx3="http://schemas.microsoft.com/office/drawing/2016/5/9/chartex" xmlns:cx4="http://schemas.microsoft.com/office/drawing/2016/5/10/chartex" xmlns:cx5="http://schemas.microsoft.com/office/drawing/2016/5/11/chartex" xmlns:cx6="http://schemas.microsoft.com/office/drawing/2016/5/12/chartex" xmlns:cx7="http://schemas.microsoft.com/office/drawing/2016/5/13/chartex" xmlns:cx8="http://schemas.microsoft.com/office/drawing/2016/5/14/chartex" xmlns:mc="http://schemas.openxmlformats.org/markup-compatibility/2006" xmlns:aink="http://schemas.microsoft.com/office/drawing/2016/ink" xmlns:am3d="http://schemas.microsoft.com/office/drawing/2017/model3d" xmlns:o="urn:schemas-microsoft-com:office:office" xmlns:oel="http://schemas.microsoft.com/office/2019/extlst" xmlns:r="http://schemas.openxmlformats.org/officeDocument/2006/relationships" xmlns:m="http://schemas.openxmlformats.org/officeDocument/2006/math" xmlns:v="urn:schemas-microsoft-com:vml" xmlns:wp14="http://schemas.microsoft.com/office/word/2010/wordprocessingDrawing" xmlns:wp="http://schemas.openxmlformats.org/drawingml/2006/wordprocessingDrawing" xmlns:w10="urn:schemas-microsoft-com:office:word" xmlns:w="http://schemas.openxmlformats.org/wordprocessingml/2006/main" xmlns:w14="http://schemas.microsoft.com/office/word/2010/wordml" xmlns:w15="http://schemas.microsoft.com/office/word/2012/wordml" xmlns:w16cex="http://schemas.microsoft.com/office/word/2018/wordml/cex" xmlns:w16cid="http://schemas.microsoft.com/office/word/2016/wordml/cid" xmlns:w16="http://schemas.microsoft.com/office/word/2018/wordml" xmlns:w16sdtdh="http://schemas.microsoft.com/office/word/2020/wordml/sdtdatahash" xmlns:w16se="http://schemas.microsoft.com/office/word/2015/wordml/symex" xmlns:wpg="http://schemas.microsoft.com/office/word/2010/wordprocessingGroup" xmlns:wpi="http://schemas.microsoft.com/office/word/2010/wordprocessingInk" xmlns:wne="http://schemas.microsoft.com/office/word/2006/wordml" xmlns:wps="http://schemas.microsoft.com/office/word/2010/wordprocessingShape" mc:Ignorable="w14 w15 w16se w16cid w16 w16cex w16sdtdh wp14">
+<w:document xmlns:wpc="http://schemas.microsoft.com/office/word/2010/wordprocessingCanvas" xmlns:cx="http://schemas.microsoft.com/office/drawing/2014/chartex" xmlns:cx1="http://schemas.microsoft.com/office/drawing/2015/9/8/chartex" xmlns:cx2="http://schemas.microsoft.com/office/drawing/2015/10/21/chartex" xmlns:cx3="http://schemas.microsoft.com/office/drawing/2016/5/9/chartex" xmlns:cx4="http://schemas.microsoft.com/office/drawing/2016/5/10/chartex" xmlns:cx5="http://schemas.microsoft.com/office/drawing/2016/5/11/chartex" xmlns:cx6="http://schemas.microsoft.com/office/drawing/2016/5/12/chartex" xmlns:cx7="http://schemas.microsoft.com/office/drawing/2016/5/13/chartex" xmlns:cx8="http://schemas.microsoft.com/office/drawing/2016/5/14/chartex" xmlns:mc="http://schemas.openxmlformats.org/markup-compatibility/2006" xmlns:aink="http://schemas.microsoft.com/office/drawing/2016/ink" xmlns:am3d="http://schemas.microsoft.com/office/drawing/2017/model3d" xmlns:o="urn:schemas-microsoft-com:office:office" xmlns:oel="http://schemas.microsoft.com/office/2019/extlst" xmlns:r="http://schemas.openxmlformats.org/officeDocument/2006/relationships" xmlns:m="http://schemas.openxmlformats.org/officeDocument/2006/math" xmlns:v="urn:schemas-microsoft-com:vml" xmlns:wp14="http://schemas.microsoft.com/office/word/2010/wordprocessingDrawing" xmlns:wp="http://schemas.openxmlformats.org/drawingml/2006/wordprocessingDrawing" xmlns:w10="urn:schemas-microsoft-com:office:word" xmlns:w="http://schemas.openxmlformats.org/wordprocessingml/2006/main" xmlns:w14="http://schemas.microsoft.com/office/word/2010/wordml" xmlns:w15="http://schemas.microsoft.com/office/word/2012/wordml" xmlns:w16cex="http://schemas.microsoft.com/office/word/2018/wordml/cex" xmlns:w16cid="http://schemas.microsoft.com/office/word/2016/wordml/cid" xmlns:w16="http://schemas.microsoft.com/office/word/2018/wordml" xmlns:w16du="http://schemas.microsoft.com/office/word/2023/wordml/word16du" xmlns:w16sdtdh="http://schemas.microsoft.com/office/word/2020/wordml/sdtdatahash" xmlns:w16sdtfl="http://schemas.microsoft.com/office/word/2024/wordml/sdtformatlock" xmlns:w16se="http://schemas.microsoft.com/office/word/2015/wordml/symex" xmlns:wpg="http://schemas.microsoft.com/office/word/2010/wordprocessingGroup" xmlns:wpi="http://schemas.microsoft.com/office/word/2010/wordprocessingInk" xmlns:wne="http://schemas.microsoft.com/office/word/2006/wordml" xmlns:wps="http://schemas.microsoft.com/office/word/2010/wordprocessingShape" mc:Ignorable="w14 w15 w16se w16cid w16 w16cex w16sdtdh w16sdtfl w16du wp14">
   <w:body>
     <w:p>
       <w:pPr>
@@ -94,42 +94,81 @@
     <w:p>
       <w:pPr>
         <w:spacing w:after="0" w:line="240" w:lineRule="auto"/>
-      </w:pPr>
-      <w:r>
+        <w:rPr>
+          <w:lang w:val="pt-BR"/>
+        </w:rPr>
+      </w:pPr>
+      <w:r>
+        <w:rPr>
+          <w:lang w:val="pt-BR"/>
+        </w:rPr>
         <w:t>João Pessoa/PB</w:t>
       </w:r>
       <w:r>
-        <w:t>, Brazil</w:t>
-      </w:r>
-      <w:r>
+        <w:rPr>
+          <w:lang w:val="pt-BR"/>
+        </w:rPr>
+        <w:t xml:space="preserve">, </w:t>
+      </w:r>
+      <w:proofErr w:type="spellStart"/>
+      <w:r>
+        <w:rPr>
+          <w:lang w:val="pt-BR"/>
+        </w:rPr>
+        <w:t>Brazil</w:t>
+      </w:r>
+      <w:proofErr w:type="spellEnd"/>
+      <w:r>
+        <w:rPr>
+          <w:lang w:val="pt-BR"/>
+        </w:rPr>
         <w:t xml:space="preserve"> </w:t>
       </w:r>
       <w:bookmarkStart w:id="0" w:name="_Hlk204853790"/>
       <w:r>
+        <w:rPr>
+          <w:lang w:val="pt-BR"/>
+        </w:rPr>
         <w:tab/>
       </w:r>
       <w:r>
+        <w:rPr>
+          <w:lang w:val="pt-BR"/>
+        </w:rPr>
         <w:t>•</w:t>
       </w:r>
       <w:bookmarkEnd w:id="0"/>
       <w:r>
+        <w:rPr>
+          <w:lang w:val="pt-BR"/>
+        </w:rPr>
         <w:t xml:space="preserve"> </w:t>
       </w:r>
       <w:hyperlink r:id="rId8" w:history="1">
         <w:r>
           <w:rPr>
             <w:rStyle w:val="Hyperlink"/>
+            <w:lang w:val="pt-BR"/>
           </w:rPr>
           <w:t>+55 83 99126-3772</w:t>
         </w:r>
       </w:hyperlink>
       <w:r>
+        <w:rPr>
+          <w:lang w:val="pt-BR"/>
+        </w:rPr>
         <w:t xml:space="preserve"> (WhatsApp) </w:t>
       </w:r>
       <w:r>
+        <w:rPr>
+          <w:lang w:val="pt-BR"/>
+        </w:rPr>
         <w:tab/>
       </w:r>
       <w:r>
+        <w:rPr>
+          <w:lang w:val="pt-BR"/>
+        </w:rPr>
         <w:t xml:space="preserve">• </w:t>
       </w:r>
       <w:hyperlink r:id="rId9">
@@ -137,11 +176,15 @@
           <w:rPr>
             <w:rStyle w:val="Hyperlink"/>
             <w:color w:val="auto"/>
+            <w:lang w:val="pt-BR"/>
           </w:rPr>
           <w:t>huannvictor@gmail.com</w:t>
         </w:r>
       </w:hyperlink>
       <w:r>
+        <w:rPr>
+          <w:lang w:val="pt-BR"/>
+        </w:rPr>
         <w:t xml:space="preserve"> </w:t>
       </w:r>
     </w:p>
@@ -603,65 +646,89 @@
           <w:bCs/>
           <w:sz w:val="18"/>
           <w:szCs w:val="18"/>
-          <w:lang w:eastAsia="pt-BR"/>
-        </w:rPr>
-      </w:pPr>
-      <w:r>
-        <w:rPr>
-          <w:b/>
-          <w:bCs/>
-        </w:rPr>
-        <w:t xml:space="preserve">(05/2018 – present) </w:t>
-      </w:r>
-      <w:r>
-        <w:rPr>
-          <w:b/>
-          <w:bCs/>
-        </w:rPr>
-        <w:t xml:space="preserve">Sales Assistant &amp; Automation Developer | </w:t>
+          <w:lang w:val="pt-BR" w:eastAsia="pt-BR"/>
+        </w:rPr>
+      </w:pPr>
+      <w:r>
+        <w:rPr>
+          <w:b/>
+          <w:bCs/>
+          <w:lang w:val="pt-BR"/>
+        </w:rPr>
+        <w:t xml:space="preserve">(05/2018 – </w:t>
+      </w:r>
+      <w:r>
+        <w:rPr>
+          <w:b/>
+          <w:bCs/>
+          <w:lang w:val="pt-BR"/>
+        </w:rPr>
+        <w:t>06/2</w:t>
+      </w:r>
+      <w:r>
+        <w:rPr>
+          <w:b/>
+          <w:bCs/>
+          <w:lang w:val="pt-BR"/>
+        </w:rPr>
+        <w:t>026</w:t>
+      </w:r>
+      <w:r>
+        <w:rPr>
+          <w:b/>
+          <w:bCs/>
+          <w:lang w:val="pt-BR"/>
+        </w:rPr>
+        <w:t xml:space="preserve">) </w:t>
+      </w:r>
+      <w:r>
+        <w:rPr>
+          <w:b/>
+          <w:bCs/>
+          <w:lang w:val="pt-BR"/>
+        </w:rPr>
+        <w:t xml:space="preserve">Sales Assistant &amp; Automation </w:t>
       </w:r>
       <w:proofErr w:type="spellStart"/>
       <w:r>
         <w:rPr>
           <w:b/>
           <w:bCs/>
-        </w:rPr>
-        <w:t>Editora</w:t>
+          <w:lang w:val="pt-BR"/>
+        </w:rPr>
+        <w:t>Developer</w:t>
       </w:r>
       <w:proofErr w:type="spellEnd"/>
       <w:r>
         <w:rPr>
           <w:b/>
           <w:bCs/>
-        </w:rPr>
-        <w:t xml:space="preserve"> </w:t>
-      </w:r>
-      <w:proofErr w:type="spellStart"/>
-      <w:r>
-        <w:rPr>
-          <w:b/>
-          <w:bCs/>
-        </w:rPr>
-        <w:t>Construir</w:t>
-      </w:r>
-      <w:proofErr w:type="spellEnd"/>
-      <w:r>
-        <w:rPr>
-          <w:b/>
-          <w:bCs/>
-        </w:rPr>
-        <w:t xml:space="preserve"> </w:t>
-      </w:r>
-      <w:r>
+          <w:lang w:val="pt-BR"/>
+        </w:rPr>
+        <w:t xml:space="preserve"> | Editora Construir </w:t>
+      </w:r>
+      <w:r>
+        <w:rPr>
+          <w:lang w:val="pt-BR"/>
+        </w:rPr>
         <w:t>|</w:t>
       </w:r>
       <w:r>
+        <w:rPr>
+          <w:lang w:val="pt-BR"/>
+        </w:rPr>
         <w:t xml:space="preserve"> João Pessoa</w:t>
       </w:r>
       <w:r>
+        <w:rPr>
+          <w:lang w:val="pt-BR"/>
+        </w:rPr>
         <w:t>/</w:t>
       </w:r>
       <w:r>
+        <w:rPr>
+          <w:lang w:val="pt-BR"/>
+        </w:rPr>
         <w:t>PB</w:t>
       </w:r>
     </w:p>
@@ -2037,7 +2104,7 @@
 </file>
 
 <file path=word/numbering.xml><?xml version="1.0" encoding="utf-8"?>
-<w:numbering xmlns:wpc="http://schemas.microsoft.com/office/word/2010/wordprocessingCanvas" xmlns:cx="http://schemas.microsoft.com/office/drawing/2014/chartex" xmlns:cx1="http://schemas.microsoft.com/office/drawing/2015/9/8/chartex" xmlns:cx2="http://schemas.microsoft.com/office/drawing/2015/10/21/chartex" xmlns:cx3="http://schemas.microsoft.com/office/drawing/2016/5/9/chartex" xmlns:cx4="http://schemas.microsoft.com/office/drawing/2016/5/10/chartex" xmlns:cx5="http://schemas.microsoft.com/office/drawing/2016/5/11/chartex" xmlns:cx6="http://schemas.microsoft.com/office/drawing/2016/5/12/chartex" xmlns:cx7="http://schemas.microsoft.com/office/drawing/2016/5/13/chartex" xmlns:cx8="http://schemas.microsoft.com/office/drawing/2016/5/14/chartex" xmlns:mc="http://schemas.openxmlformats.org/markup-compatibility/2006" xmlns:aink="http://schemas.microsoft.com/office/drawing/2016/ink" xmlns:am3d="http://schemas.microsoft.com/office/drawing/2017/model3d" xmlns:o="urn:schemas-microsoft-com:office:office" xmlns:oel="http://schemas.microsoft.com/office/2019/extlst" xmlns:r="http://schemas.openxmlformats.org/officeDocument/2006/relationships" xmlns:m="http://schemas.openxmlformats.org/officeDocument/2006/math" xmlns:v="urn:schemas-microsoft-com:vml" xmlns:wp14="http://schemas.microsoft.com/office/word/2010/wordprocessingDrawing" xmlns:wp="http://schemas.openxmlformats.org/drawingml/2006/wordprocessingDrawing" xmlns:w10="urn:schemas-microsoft-com:office:word" xmlns:w="http://schemas.openxmlformats.org/wordprocessingml/2006/main" xmlns:w14="http://schemas.microsoft.com/office/word/2010/wordml" xmlns:w15="http://schemas.microsoft.com/office/word/2012/wordml" xmlns:w16cex="http://schemas.microsoft.com/office/word/2018/wordml/cex" xmlns:w16cid="http://schemas.microsoft.com/office/word/2016/wordml/cid" xmlns:w16="http://schemas.microsoft.com/office/word/2018/wordml" xmlns:w16sdtdh="http://schemas.microsoft.com/office/word/2020/wordml/sdtdatahash" xmlns:w16se="http://schemas.microsoft.com/office/word/2015/wordml/symex" xmlns:wpg="http://schemas.microsoft.com/office/word/2010/wordprocessingGroup" xmlns:wpi="http://schemas.microsoft.com/office/word/2010/wordprocessingInk" xmlns:wne="http://schemas.microsoft.com/office/word/2006/wordml" xmlns:wps="http://schemas.microsoft.com/office/word/2010/wordprocessingShape" mc:Ignorable="w14 w15 w16se w16cid w16 w16cex w16sdtdh wp14">
+<w:numbering xmlns:wpc="http://schemas.microsoft.com/office/word/2010/wordprocessingCanvas" xmlns:cx="http://schemas.microsoft.com/office/drawing/2014/chartex" xmlns:cx1="http://schemas.microsoft.com/office/drawing/2015/9/8/chartex" xmlns:cx2="http://schemas.microsoft.com/office/drawing/2015/10/21/chartex" xmlns:cx3="http://schemas.microsoft.com/office/drawing/2016/5/9/chartex" xmlns:cx4="http://schemas.microsoft.com/office/drawing/2016/5/10/chartex" xmlns:cx5="http://schemas.microsoft.com/office/drawing/2016/5/11/chartex" xmlns:cx6="http://schemas.microsoft.com/office/drawing/2016/5/12/chartex" xmlns:cx7="http://schemas.microsoft.com/office/drawing/2016/5/13/chartex" xmlns:cx8="http://schemas.microsoft.com/office/drawing/2016/5/14/chartex" xmlns:mc="http://schemas.openxmlformats.org/markup-compatibility/2006" xmlns:aink="http://schemas.microsoft.com/office/drawing/2016/ink" xmlns:am3d="http://schemas.microsoft.com/office/drawing/2017/model3d" xmlns:o="urn:schemas-microsoft-com:office:office" xmlns:oel="http://schemas.microsoft.com/office/2019/extlst" xmlns:r="http://schemas.openxmlformats.org/officeDocument/2006/relationships" xmlns:m="http://schemas.openxmlformats.org/officeDocument/2006/math" xmlns:v="urn:schemas-microsoft-com:vml" xmlns:wp14="http://schemas.microsoft.com/office/word/2010/wordprocessingDrawing" xmlns:wp="http://schemas.openxmlformats.org/drawingml/2006/wordprocessingDrawing" xmlns:w10="urn:schemas-microsoft-com:office:word" xmlns:w="http://schemas.openxmlformats.org/wordprocessingml/2006/main" xmlns:w14="http://schemas.microsoft.com/office/word/2010/wordml" xmlns:w15="http://schemas.microsoft.com/office/word/2012/wordml" xmlns:w16cex="http://schemas.microsoft.com/office/word/2018/wordml/cex" xmlns:w16cid="http://schemas.microsoft.com/office/word/2016/wordml/cid" xmlns:w16="http://schemas.microsoft.com/office/word/2018/wordml" xmlns:w16du="http://schemas.microsoft.com/office/word/2023/wordml/word16du" xmlns:w16sdtdh="http://schemas.microsoft.com/office/word/2020/wordml/sdtdatahash" xmlns:w16sdtfl="http://schemas.microsoft.com/office/word/2024/wordml/sdtformatlock" xmlns:w16se="http://schemas.microsoft.com/office/word/2015/wordml/symex" xmlns:wpg="http://schemas.microsoft.com/office/word/2010/wordprocessingGroup" xmlns:wpi="http://schemas.microsoft.com/office/word/2010/wordprocessingInk" xmlns:wne="http://schemas.microsoft.com/office/word/2006/wordml" xmlns:wps="http://schemas.microsoft.com/office/word/2010/wordprocessingShape" mc:Ignorable="w14 w15 w16se w16cid w16 w16cex w16sdtdh w16sdtfl w16du wp14">
   <w:abstractNum w:abstractNumId="0" w15:restartNumberingAfterBreak="0">
     <w:nsid w:val="03DD578C"/>
     <w:multiLevelType w:val="hybridMultilevel"/>
@@ -4746,7 +4813,7 @@
 </file>
 
 <file path=word/styles.xml><?xml version="1.0" encoding="utf-8"?>
-<w:styles xmlns:mc="http://schemas.openxmlformats.org/markup-compatibility/2006" xmlns:r="http://schemas.openxmlformats.org/officeDocument/2006/relationships" xmlns:w="http://schemas.openxmlformats.org/wordprocessingml/2006/main" xmlns:w14="http://schemas.microsoft.com/office/word/2010/wordml" xmlns:w15="http://schemas.microsoft.com/office/word/2012/wordml" xmlns:w16cex="http://schemas.microsoft.com/office/word/2018/wordml/cex" xmlns:w16cid="http://schemas.microsoft.com/office/word/2016/wordml/cid" xmlns:w16="http://schemas.microsoft.com/office/word/2018/wordml" xmlns:w16sdtdh="http://schemas.microsoft.com/office/word/2020/wordml/sdtdatahash" xmlns:w16se="http://schemas.microsoft.com/office/word/2015/wordml/symex" mc:Ignorable="w14 w15 w16se w16cid w16 w16cex w16sdtdh">
+<w:styles xmlns:mc="http://schemas.openxmlformats.org/markup-compatibility/2006" xmlns:r="http://schemas.openxmlformats.org/officeDocument/2006/relationships" xmlns:w="http://schemas.openxmlformats.org/wordprocessingml/2006/main" xmlns:w14="http://schemas.microsoft.com/office/word/2010/wordml" xmlns:w15="http://schemas.microsoft.com/office/word/2012/wordml" xmlns:w16cex="http://schemas.microsoft.com/office/word/2018/wordml/cex" xmlns:w16cid="http://schemas.microsoft.com/office/word/2016/wordml/cid" xmlns:w16="http://schemas.microsoft.com/office/word/2018/wordml" xmlns:w16du="http://schemas.microsoft.com/office/word/2023/wordml/word16du" xmlns:w16sdtdh="http://schemas.microsoft.com/office/word/2020/wordml/sdtdatahash" xmlns:w16sdtfl="http://schemas.microsoft.com/office/word/2024/wordml/sdtformatlock" xmlns:w16se="http://schemas.microsoft.com/office/word/2015/wordml/symex" mc:Ignorable="w14 w15 w16se w16cid w16 w16cex w16sdtdh w16sdtfl w16du">
   <w:docDefaults>
     <w:rPrDefault>
       <w:rPr>

</xml_diff>